<commit_message>
Revise game design document and enhance UI for orb mechanics
- Updated the game design document to clarify gameplay mechanics, including the introduction of the Blank Orb and its attributes.
- Added details on glyph mechanics, including types, rarities, and their integration with orbs.
- Enhanced the ritual menu UI to improve player interaction with orb attributes and recycling mechanics.
- Adjusted font sizes and layout in the attribute box for better readability and consistency across UI elements.
</commit_message>
<xml_diff>
--- a/planning/A Final Spell.docx
+++ b/planning/A Final Spell.docx
@@ -1,6 +1,6 @@
 
 <file path=word/document.xml><?xml version="1.0" encoding="utf-8"?>
-<w:document xmlns:wpc="http://schemas.microsoft.com/office/word/2010/wordprocessingCanvas" xmlns:cx="http://schemas.microsoft.com/office/drawing/2014/chartex" xmlns:cx1="http://schemas.microsoft.com/office/drawing/2015/9/8/chartex" xmlns:cx2="http://schemas.microsoft.com/office/drawing/2015/10/21/chartex" xmlns:cx3="http://schemas.microsoft.com/office/drawing/2016/5/9/chartex" xmlns:cx4="http://schemas.microsoft.com/office/drawing/2016/5/10/chartex" xmlns:cx5="http://schemas.microsoft.com/office/drawing/2016/5/11/chartex" xmlns:cx6="http://schemas.microsoft.com/office/drawing/2016/5/12/chartex" xmlns:cx7="http://schemas.microsoft.com/office/drawing/2016/5/13/chartex" xmlns:cx8="http://schemas.microsoft.com/office/drawing/2016/5/14/chartex" xmlns:mc="http://schemas.openxmlformats.org/markup-compatibility/2006" xmlns:aink="http://schemas.microsoft.com/office/drawing/2016/ink" xmlns:am3d="http://schemas.microsoft.com/office/drawing/2017/model3d" xmlns:o="urn:schemas-microsoft-com:office:office" xmlns:oel="http://schemas.microsoft.com/office/2019/extlst" xmlns:r="http://schemas.openxmlformats.org/officeDocument/2006/relationships" xmlns:m="http://schemas.openxmlformats.org/officeDocument/2006/math" xmlns:v="urn:schemas-microsoft-com:vml" xmlns:wp14="http://schemas.microsoft.com/office/word/2010/wordprocessingDrawing" xmlns:wp="http://schemas.openxmlformats.org/drawingml/2006/wordprocessingDrawing" xmlns:w10="urn:schemas-microsoft-com:office:word" xmlns:w="http://schemas.openxmlformats.org/wordprocessingml/2006/main" xmlns:w14="http://schemas.microsoft.com/office/word/2010/wordml" xmlns:w15="http://schemas.microsoft.com/office/word/2012/wordml" xmlns:w16cei="http://schemas.microsoft.com/office/word/2026/wordml/cei" xmlns:w16cex="http://schemas.microsoft.com/office/word/2018/wordml/cex" xmlns:w16cid="http://schemas.microsoft.com/office/word/2016/wordml/cid" xmlns:w16="http://schemas.microsoft.com/office/word/2018/wordml" xmlns:w16du="http://schemas.microsoft.com/office/word/2023/wordml/word16du" xmlns:w16sdtdh="http://schemas.microsoft.com/office/word/2020/wordml/sdtdatahash" xmlns:w16sdtfl="http://schemas.microsoft.com/office/word/2024/wordml/sdtformatlock" xmlns:w16se="http://schemas.microsoft.com/office/word/2015/wordml/symex" xmlns:wpg="http://schemas.microsoft.com/office/word/2010/wordprocessingGroup" xmlns:wpi="http://schemas.microsoft.com/office/word/2010/wordprocessingInk" xmlns:wne="http://schemas.microsoft.com/office/word/2006/wordml" xmlns:wps="http://schemas.microsoft.com/office/word/2010/wordprocessingShape" mc:Ignorable="w14 w15 w16se w16cid w16 w16cex w16sdtdh w16sdtfl w16du wp14">
+<w:document xmlns:wpc="http://schemas.microsoft.com/office/word/2010/wordprocessingCanvas" xmlns:cx="http://schemas.microsoft.com/office/drawing/2014/chartex" xmlns:cx1="http://schemas.microsoft.com/office/drawing/2015/9/8/chartex" xmlns:cx2="http://schemas.microsoft.com/office/drawing/2015/10/21/chartex" xmlns:cx3="http://schemas.microsoft.com/office/drawing/2016/5/9/chartex" xmlns:cx4="http://schemas.microsoft.com/office/drawing/2016/5/10/chartex" xmlns:cx5="http://schemas.microsoft.com/office/drawing/2016/5/11/chartex" xmlns:cx6="http://schemas.microsoft.com/office/drawing/2016/5/12/chartex" xmlns:cx7="http://schemas.microsoft.com/office/drawing/2016/5/13/chartex" xmlns:cx8="http://schemas.microsoft.com/office/drawing/2016/5/14/chartex" xmlns:mc="http://schemas.openxmlformats.org/markup-compatibility/2006" xmlns:aink="http://schemas.microsoft.com/office/drawing/2016/ink" xmlns:am3d="http://schemas.microsoft.com/office/drawing/2017/model3d" xmlns:o="urn:schemas-microsoft-com:office:office" xmlns:oel="http://schemas.microsoft.com/office/2019/extlst" xmlns:r="http://schemas.openxmlformats.org/officeDocument/2006/relationships" xmlns:m="http://schemas.openxmlformats.org/officeDocument/2006/math" xmlns:v="urn:schemas-microsoft-com:vml" xmlns:wp14="http://schemas.microsoft.com/office/word/2010/wordprocessingDrawing" xmlns:wp="http://schemas.openxmlformats.org/drawingml/2006/wordprocessingDrawing" xmlns:w10="urn:schemas-microsoft-com:office:word" xmlns:w="http://schemas.openxmlformats.org/wordprocessingml/2006/main" xmlns:w14="http://schemas.microsoft.com/office/word/2010/wordml" xmlns:w15="http://schemas.microsoft.com/office/word/2012/wordml" xmlns:w16cex="http://schemas.microsoft.com/office/word/2018/wordml/cex" xmlns:w16cid="http://schemas.microsoft.com/office/word/2016/wordml/cid" xmlns:w16="http://schemas.microsoft.com/office/word/2018/wordml" xmlns:w16du="http://schemas.microsoft.com/office/word/2023/wordml/word16du" xmlns:w16sdtdh="http://schemas.microsoft.com/office/word/2020/wordml/sdtdatahash" xmlns:w16sdtfl="http://schemas.microsoft.com/office/word/2024/wordml/sdtformatlock" xmlns:w16se="http://schemas.microsoft.com/office/word/2015/wordml/symex" xmlns:wpg="http://schemas.microsoft.com/office/word/2010/wordprocessingGroup" xmlns:wpi="http://schemas.microsoft.com/office/word/2010/wordprocessingInk" xmlns:wne="http://schemas.microsoft.com/office/word/2006/wordml" xmlns:wps="http://schemas.microsoft.com/office/word/2010/wordprocessingShape" mc:Ignorable="w14 w15 w16se w16cid w16 w16cex w16sdtdh w16sdtfl w16du wp14">
   <w:body>
     <w:p>
       <w:pPr>
@@ -59,31 +59,43 @@
         <w:rPr>
           <w:lang w:val="en-US"/>
         </w:rPr>
-        <w:t xml:space="preserve">. You have </w:t>
-      </w:r>
-      <w:r>
-        <w:rPr>
-          <w:lang w:val="en-US"/>
-        </w:rPr>
-        <w:t xml:space="preserve">only </w:t>
-      </w:r>
-      <w:r>
-        <w:rPr>
-          <w:lang w:val="en-US"/>
-        </w:rPr>
-        <w:t xml:space="preserve">one </w:t>
-      </w:r>
-      <w:r>
-        <w:rPr>
-          <w:lang w:val="en-US"/>
-        </w:rPr>
-        <w:t>spell left to shoot: the orb of chaos</w:t>
-      </w:r>
-      <w:r>
-        <w:rPr>
-          <w:lang w:val="en-US"/>
-        </w:rPr>
-        <w:t xml:space="preserve">. Game starts with you firing that </w:t>
+        <w:t>. You</w:t>
+      </w:r>
+      <w:r>
+        <w:rPr>
+          <w:lang w:val="en-US"/>
+        </w:rPr>
+        <w:t>r only weapon at first is a orb</w:t>
+      </w:r>
+      <w:r>
+        <w:rPr>
+          <w:lang w:val="en-US"/>
+        </w:rPr>
+        <w:t xml:space="preserve">: </w:t>
+      </w:r>
+      <w:r>
+        <w:rPr>
+          <w:lang w:val="en-US"/>
+        </w:rPr>
+        <w:t>a Blank Orb</w:t>
+      </w:r>
+      <w:r>
+        <w:rPr>
+          <w:lang w:val="en-US"/>
+        </w:rPr>
+        <w:t>. Game starts with you</w:t>
+      </w:r>
+      <w:r>
+        <w:rPr>
+          <w:lang w:val="en-US"/>
+        </w:rPr>
+        <w:t>r summoning circle shooting</w:t>
+      </w:r>
+      <w:r>
+        <w:rPr>
+          <w:lang w:val="en-US"/>
+        </w:rPr>
+        <w:t xml:space="preserve"> that </w:t>
       </w:r>
       <w:r>
         <w:rPr>
@@ -138,25 +150,25 @@
           <w:lang w:val="en-US"/>
         </w:rPr>
         <w:br/>
-        <w:t xml:space="preserve">To help you kill your enemies you can re-direct the bullet by being close to it and pressing a button. </w:t>
-      </w:r>
-      <w:r>
-        <w:rPr>
-          <w:lang w:val="en-US"/>
-        </w:rPr>
-        <w:t>The orb then travels around you and you can release it</w:t>
-      </w:r>
-      <w:r>
-        <w:rPr>
-          <w:lang w:val="en-US"/>
-        </w:rPr>
-        <w:t xml:space="preserve"> </w:t>
-      </w:r>
-      <w:r>
-        <w:rPr>
-          <w:lang w:val="en-US"/>
-        </w:rPr>
-        <w:t>in order to aim it where you want it to go.</w:t>
+        <w:t xml:space="preserve">To help you kill your enemies you can re-direct the bullet by being close to it and </w:t>
+      </w:r>
+      <w:r>
+        <w:rPr>
+          <w:lang w:val="en-US"/>
+        </w:rPr>
+        <w:t>redirecting it</w:t>
+      </w:r>
+      <w:r>
+        <w:rPr>
+          <w:lang w:val="en-US"/>
+        </w:rPr>
+        <w:t xml:space="preserve">. </w:t>
+      </w:r>
+      <w:r>
+        <w:rPr>
+          <w:lang w:val="en-US"/>
+        </w:rPr>
+        <w:t>Each time you redirect it it goes faster and does more damage (to both you and enemies!)</w:t>
       </w:r>
       <w:r>
         <w:rPr>
@@ -316,13 +328,7 @@
         <w:rPr>
           <w:lang w:val="en-US"/>
         </w:rPr>
-        <w:t xml:space="preserve">The </w:t>
-      </w:r>
-      <w:r>
-        <w:rPr>
-          <w:lang w:val="en-US"/>
-        </w:rPr>
-        <w:t>orb</w:t>
+        <w:t>Orbs</w:t>
       </w:r>
     </w:p>
     <w:p>
@@ -335,13 +341,43 @@
         <w:rPr>
           <w:lang w:val="en-SE"/>
         </w:rPr>
-        <w:t xml:space="preserve">Shot by the player at the beginning of the game in any direction from where they are standing (center bottom screen). Then the </w:t>
-      </w:r>
-      <w:r>
-        <w:rPr>
-          <w:lang w:val="en-SE"/>
-        </w:rPr>
-        <w:t xml:space="preserve">orb </w:t>
+        <w:t>Shot by the player</w:t>
+      </w:r>
+      <w:r>
+        <w:rPr>
+          <w:lang w:val="en-SE"/>
+        </w:rPr>
+        <w:t xml:space="preserve">s summoning circle </w:t>
+      </w:r>
+      <w:r>
+        <w:rPr>
+          <w:lang w:val="en-SE"/>
+        </w:rPr>
+        <w:t xml:space="preserve">at the beginning of the game in </w:t>
+      </w:r>
+      <w:r>
+        <w:rPr>
+          <w:lang w:val="en-SE"/>
+        </w:rPr>
+        <w:t>a random direction</w:t>
+      </w:r>
+      <w:r>
+        <w:rPr>
+          <w:lang w:val="en-SE"/>
+        </w:rPr>
+        <w:t xml:space="preserve"> Then the </w:t>
+      </w:r>
+      <w:r>
+        <w:rPr>
+          <w:lang w:val="en-SE"/>
+        </w:rPr>
+        <w:t>orb</w:t>
+      </w:r>
+      <w:r>
+        <w:rPr>
+          <w:lang w:val="en-SE"/>
+        </w:rPr>
+        <w:t xml:space="preserve">s </w:t>
       </w:r>
       <w:r>
         <w:rPr>
@@ -354,6 +390,13 @@
           <w:lang w:val="en-SE"/>
         </w:rPr>
         <w:t>The orbs speed and damage increases each time you redirect it</w:t>
+      </w:r>
+      <w:r>
+        <w:rPr>
+          <w:lang w:val="en-SE"/>
+        </w:rPr>
+        <w:br/>
+        <w:t>You start with one orb but can acquire more later on.</w:t>
       </w:r>
       <w:r>
         <w:rPr>
@@ -370,16 +413,15 @@
     </w:p>
     <w:p>
       <w:pPr>
-        <w:pStyle w:val="Heading2"/>
-        <w:rPr>
-          <w:lang w:val="en-SE"/>
-        </w:rPr>
-      </w:pPr>
-      <w:r>
-        <w:rPr>
-          <w:lang w:val="en-SE"/>
-        </w:rPr>
-        <w:t>Stage</w:t>
+        <w:rPr>
+          <w:lang w:val="en-SE"/>
+        </w:rPr>
+      </w:pPr>
+      <w:r>
+        <w:rPr>
+          <w:lang w:val="en-SE"/>
+        </w:rPr>
+        <w:br w:type="page"/>
       </w:r>
     </w:p>
     <w:p>
@@ -392,87 +434,981 @@
         <w:rPr>
           <w:lang w:val="en-SE"/>
         </w:rPr>
-        <w:t xml:space="preserve">There will be different stages and environment, with </w:t>
-      </w:r>
-      <w:r>
-        <w:rPr>
-          <w:lang w:val="en-SE"/>
-        </w:rPr>
-        <w:t>randomized enemies</w:t>
-      </w:r>
-      <w:r>
-        <w:rPr>
-          <w:lang w:val="en-SE"/>
-        </w:rPr>
-        <w:t xml:space="preserve"> and </w:t>
-      </w:r>
-      <w:r>
-        <w:rPr>
-          <w:lang w:val="en-SE"/>
-        </w:rPr>
-        <w:t>obstacles</w:t>
-      </w:r>
-      <w:r>
-        <w:rPr>
-          <w:lang w:val="en-SE"/>
-        </w:rPr>
-        <w:t xml:space="preserve">. Various obstacles interact with the </w:t>
-      </w:r>
-      <w:r>
-        <w:rPr>
-          <w:lang w:val="en-SE"/>
-        </w:rPr>
-        <w:t>orb</w:t>
-      </w:r>
-      <w:r>
-        <w:rPr>
-          <w:lang w:val="en-SE"/>
-        </w:rPr>
-        <w:t xml:space="preserve"> and the environment. For example, a barrel of TNT can explode.</w:t>
+        <w:lastRenderedPageBreak/>
+        <w:t>Orbs have 12 a</w:t>
+      </w:r>
+      <w:r>
+        <w:rPr>
+          <w:lang w:val="en-SE"/>
+        </w:rPr>
+        <w:t>t</w:t>
+      </w:r>
+      <w:r>
+        <w:rPr>
+          <w:lang w:val="en-SE"/>
+        </w:rPr>
+        <w:t>tributes</w:t>
+      </w:r>
+      <w:r>
+        <w:rPr>
+          <w:lang w:val="en-SE"/>
+        </w:rPr>
+        <w:t>:</w:t>
       </w:r>
       <w:r>
         <w:rPr>
           <w:lang w:val="en-SE"/>
         </w:rPr>
         <w:br/>
-        <w:t>Breaking some things can yield various powerups for the player.</w:t>
-      </w:r>
+      </w:r>
+    </w:p>
+    <w:tbl>
+      <w:tblPr>
+        <w:tblW w:w="9463" w:type="dxa"/>
+        <w:tblLook w:val="04A0" w:firstRow="1" w:lastRow="0" w:firstColumn="1" w:lastColumn="0" w:noHBand="0" w:noVBand="1"/>
+      </w:tblPr>
+      <w:tblGrid>
+        <w:gridCol w:w="2689"/>
+        <w:gridCol w:w="2894"/>
+        <w:gridCol w:w="1940"/>
+        <w:gridCol w:w="1940"/>
+      </w:tblGrid>
+      <w:tr>
+        <w:trPr>
+          <w:trHeight w:val="300"/>
+        </w:trPr>
+        <w:tc>
+          <w:tcPr>
+            <w:tcW w:w="2689" w:type="dxa"/>
+            <w:tcBorders>
+              <w:top w:val="single" w:sz="4" w:space="0" w:color="000000"/>
+              <w:left w:val="single" w:sz="4" w:space="0" w:color="000000"/>
+              <w:bottom w:val="single" w:sz="4" w:space="0" w:color="000000"/>
+              <w:right w:val="single" w:sz="4" w:space="0" w:color="000000"/>
+            </w:tcBorders>
+            <w:vAlign w:val="center"/>
+            <w:hideMark/>
+          </w:tcPr>
+          <w:p>
+            <w:pPr>
+              <w:spacing w:after="0" w:line="240" w:lineRule="auto"/>
+              <w:rPr>
+                <w:rFonts w:ascii="Aptos Narrow" w:eastAsia="Times New Roman" w:hAnsi="Aptos Narrow" w:cs="Times New Roman"/>
+                <w:b/>
+                <w:bCs/>
+                <w:color w:val="000000"/>
+                <w:kern w:val="0"/>
+                <w:lang w:val="en-SE" w:eastAsia="en-SE"/>
+                <w14:ligatures w14:val="none"/>
+              </w:rPr>
+            </w:pPr>
+            <w:r>
+              <w:rPr>
+                <w:rFonts w:ascii="Aptos Narrow" w:eastAsia="Times New Roman" w:hAnsi="Aptos Narrow" w:cs="Times New Roman"/>
+                <w:b/>
+                <w:bCs/>
+                <w:color w:val="000000"/>
+                <w:kern w:val="0"/>
+                <w:lang w:val="en-SE" w:eastAsia="en-SE"/>
+                <w14:ligatures w14:val="none"/>
+              </w:rPr>
+              <w:t>damage</w:t>
+            </w:r>
+          </w:p>
+        </w:tc>
+        <w:tc>
+          <w:tcPr>
+            <w:tcW w:w="2894" w:type="dxa"/>
+            <w:tcBorders>
+              <w:top w:val="single" w:sz="4" w:space="0" w:color="000000"/>
+              <w:left w:val="nil"/>
+              <w:bottom w:val="single" w:sz="4" w:space="0" w:color="000000"/>
+              <w:right w:val="single" w:sz="4" w:space="0" w:color="000000"/>
+            </w:tcBorders>
+            <w:vAlign w:val="center"/>
+            <w:hideMark/>
+          </w:tcPr>
+          <w:p>
+            <w:pPr>
+              <w:spacing w:after="0" w:line="240" w:lineRule="auto"/>
+              <w:rPr>
+                <w:rFonts w:ascii="Aptos Narrow" w:eastAsia="Times New Roman" w:hAnsi="Aptos Narrow" w:cs="Times New Roman"/>
+                <w:b/>
+                <w:bCs/>
+                <w:color w:val="000000"/>
+                <w:kern w:val="0"/>
+                <w:lang w:val="en-SE" w:eastAsia="en-SE"/>
+                <w14:ligatures w14:val="none"/>
+              </w:rPr>
+            </w:pPr>
+            <w:r>
+              <w:rPr>
+                <w:rFonts w:ascii="Aptos Narrow" w:eastAsia="Times New Roman" w:hAnsi="Aptos Narrow" w:cs="Times New Roman"/>
+                <w:b/>
+                <w:bCs/>
+                <w:color w:val="000000"/>
+                <w:kern w:val="0"/>
+                <w:lang w:val="en-SE" w:eastAsia="en-SE"/>
+                <w14:ligatures w14:val="none"/>
+              </w:rPr>
+              <w:t>self_damage</w:t>
+            </w:r>
+          </w:p>
+        </w:tc>
+        <w:tc>
+          <w:tcPr>
+            <w:tcW w:w="1940" w:type="dxa"/>
+            <w:tcBorders>
+              <w:top w:val="single" w:sz="4" w:space="0" w:color="000000"/>
+              <w:left w:val="nil"/>
+              <w:bottom w:val="single" w:sz="4" w:space="0" w:color="000000"/>
+              <w:right w:val="single" w:sz="4" w:space="0" w:color="000000"/>
+            </w:tcBorders>
+            <w:vAlign w:val="center"/>
+            <w:hideMark/>
+          </w:tcPr>
+          <w:p>
+            <w:pPr>
+              <w:spacing w:after="0" w:line="240" w:lineRule="auto"/>
+              <w:rPr>
+                <w:rFonts w:ascii="Aptos Narrow" w:eastAsia="Times New Roman" w:hAnsi="Aptos Narrow" w:cs="Times New Roman"/>
+                <w:b/>
+                <w:bCs/>
+                <w:color w:val="000000"/>
+                <w:kern w:val="0"/>
+                <w:lang w:val="en-SE" w:eastAsia="en-SE"/>
+                <w14:ligatures w14:val="none"/>
+              </w:rPr>
+            </w:pPr>
+            <w:r>
+              <w:rPr>
+                <w:rFonts w:ascii="Aptos Narrow" w:eastAsia="Times New Roman" w:hAnsi="Aptos Narrow" w:cs="Times New Roman"/>
+                <w:b/>
+                <w:bCs/>
+                <w:color w:val="000000"/>
+                <w:kern w:val="0"/>
+                <w:lang w:val="en-SE" w:eastAsia="en-SE"/>
+                <w14:ligatures w14:val="none"/>
+              </w:rPr>
+              <w:t>crit_chance</w:t>
+            </w:r>
+          </w:p>
+        </w:tc>
+        <w:tc>
+          <w:tcPr>
+            <w:tcW w:w="1940" w:type="dxa"/>
+            <w:tcBorders>
+              <w:top w:val="single" w:sz="4" w:space="0" w:color="000000"/>
+              <w:left w:val="nil"/>
+              <w:bottom w:val="single" w:sz="4" w:space="0" w:color="000000"/>
+              <w:right w:val="single" w:sz="4" w:space="0" w:color="000000"/>
+            </w:tcBorders>
+            <w:vAlign w:val="center"/>
+            <w:hideMark/>
+          </w:tcPr>
+          <w:p>
+            <w:pPr>
+              <w:spacing w:after="0" w:line="240" w:lineRule="auto"/>
+              <w:rPr>
+                <w:rFonts w:ascii="Aptos Narrow" w:eastAsia="Times New Roman" w:hAnsi="Aptos Narrow" w:cs="Times New Roman"/>
+                <w:b/>
+                <w:bCs/>
+                <w:color w:val="000000"/>
+                <w:kern w:val="0"/>
+                <w:lang w:val="en-SE" w:eastAsia="en-SE"/>
+                <w14:ligatures w14:val="none"/>
+              </w:rPr>
+            </w:pPr>
+            <w:r>
+              <w:rPr>
+                <w:rFonts w:ascii="Aptos Narrow" w:eastAsia="Times New Roman" w:hAnsi="Aptos Narrow" w:cs="Times New Roman"/>
+                <w:b/>
+                <w:bCs/>
+                <w:color w:val="000000"/>
+                <w:kern w:val="0"/>
+                <w:lang w:val="en-SE" w:eastAsia="en-SE"/>
+                <w14:ligatures w14:val="none"/>
+              </w:rPr>
+              <w:t>crit_damage</w:t>
+            </w:r>
+          </w:p>
+        </w:tc>
+      </w:tr>
+      <w:tr>
+        <w:trPr>
+          <w:trHeight w:val="1200"/>
+        </w:trPr>
+        <w:tc>
+          <w:tcPr>
+            <w:tcW w:w="2689" w:type="dxa"/>
+            <w:tcBorders>
+              <w:top w:val="nil"/>
+              <w:left w:val="single" w:sz="4" w:space="0" w:color="000000"/>
+              <w:bottom w:val="single" w:sz="4" w:space="0" w:color="000000"/>
+              <w:right w:val="single" w:sz="4" w:space="0" w:color="000000"/>
+            </w:tcBorders>
+            <w:vAlign w:val="center"/>
+            <w:hideMark/>
+          </w:tcPr>
+          <w:p>
+            <w:pPr>
+              <w:spacing w:after="0" w:line="240" w:lineRule="auto"/>
+              <w:rPr>
+                <w:rFonts w:ascii="Aptos Narrow" w:eastAsia="Times New Roman" w:hAnsi="Aptos Narrow" w:cs="Times New Roman"/>
+                <w:color w:val="000000"/>
+                <w:kern w:val="0"/>
+                <w:lang w:val="en-SE" w:eastAsia="en-SE"/>
+                <w14:ligatures w14:val="none"/>
+              </w:rPr>
+            </w:pPr>
+            <w:r>
+              <w:rPr>
+                <w:rFonts w:ascii="Aptos Narrow" w:eastAsia="Times New Roman" w:hAnsi="Aptos Narrow" w:cs="Times New Roman"/>
+                <w:color w:val="000000"/>
+                <w:kern w:val="0"/>
+                <w:lang w:val="en-SE" w:eastAsia="en-SE"/>
+                <w14:ligatures w14:val="none"/>
+              </w:rPr>
+              <w:t>HP dealt to enemies on hit.</w:t>
+            </w:r>
+          </w:p>
+        </w:tc>
+        <w:tc>
+          <w:tcPr>
+            <w:tcW w:w="2894" w:type="dxa"/>
+            <w:tcBorders>
+              <w:top w:val="nil"/>
+              <w:left w:val="nil"/>
+              <w:bottom w:val="single" w:sz="4" w:space="0" w:color="000000"/>
+              <w:right w:val="single" w:sz="4" w:space="0" w:color="000000"/>
+            </w:tcBorders>
+            <w:vAlign w:val="center"/>
+            <w:hideMark/>
+          </w:tcPr>
+          <w:p>
+            <w:pPr>
+              <w:spacing w:after="0" w:line="240" w:lineRule="auto"/>
+              <w:rPr>
+                <w:rFonts w:ascii="Aptos Narrow" w:eastAsia="Times New Roman" w:hAnsi="Aptos Narrow" w:cs="Times New Roman"/>
+                <w:color w:val="000000"/>
+                <w:kern w:val="0"/>
+                <w:lang w:val="en-SE" w:eastAsia="en-SE"/>
+                <w14:ligatures w14:val="none"/>
+              </w:rPr>
+            </w:pPr>
+            <w:r>
+              <w:rPr>
+                <w:rFonts w:ascii="Aptos Narrow" w:eastAsia="Times New Roman" w:hAnsi="Aptos Narrow" w:cs="Times New Roman"/>
+                <w:color w:val="000000"/>
+                <w:kern w:val="0"/>
+                <w:lang w:val="en-SE" w:eastAsia="en-SE"/>
+                <w14:ligatures w14:val="none"/>
+              </w:rPr>
+              <w:t>HP dealt to you on contact.</w:t>
+            </w:r>
+          </w:p>
+        </w:tc>
+        <w:tc>
+          <w:tcPr>
+            <w:tcW w:w="1940" w:type="dxa"/>
+            <w:tcBorders>
+              <w:top w:val="nil"/>
+              <w:left w:val="nil"/>
+              <w:bottom w:val="single" w:sz="4" w:space="0" w:color="000000"/>
+              <w:right w:val="single" w:sz="4" w:space="0" w:color="000000"/>
+            </w:tcBorders>
+            <w:vAlign w:val="center"/>
+            <w:hideMark/>
+          </w:tcPr>
+          <w:p>
+            <w:pPr>
+              <w:spacing w:after="0" w:line="240" w:lineRule="auto"/>
+              <w:rPr>
+                <w:rFonts w:ascii="Aptos Narrow" w:eastAsia="Times New Roman" w:hAnsi="Aptos Narrow" w:cs="Times New Roman"/>
+                <w:color w:val="000000"/>
+                <w:kern w:val="0"/>
+                <w:lang w:val="en-SE" w:eastAsia="en-SE"/>
+                <w14:ligatures w14:val="none"/>
+              </w:rPr>
+            </w:pPr>
+            <w:r>
+              <w:rPr>
+                <w:rFonts w:ascii="Aptos Narrow" w:eastAsia="Times New Roman" w:hAnsi="Aptos Narrow" w:cs="Times New Roman"/>
+                <w:color w:val="000000"/>
+                <w:kern w:val="0"/>
+                <w:lang w:val="en-SE" w:eastAsia="en-SE"/>
+                <w14:ligatures w14:val="none"/>
+              </w:rPr>
+              <w:t>Chance a hit rolls as a crit.</w:t>
+            </w:r>
+          </w:p>
+        </w:tc>
+        <w:tc>
+          <w:tcPr>
+            <w:tcW w:w="1940" w:type="dxa"/>
+            <w:tcBorders>
+              <w:top w:val="nil"/>
+              <w:left w:val="nil"/>
+              <w:bottom w:val="single" w:sz="4" w:space="0" w:color="000000"/>
+              <w:right w:val="single" w:sz="4" w:space="0" w:color="000000"/>
+            </w:tcBorders>
+            <w:vAlign w:val="center"/>
+            <w:hideMark/>
+          </w:tcPr>
+          <w:p>
+            <w:pPr>
+              <w:spacing w:after="0" w:line="240" w:lineRule="auto"/>
+              <w:rPr>
+                <w:rFonts w:ascii="Aptos Narrow" w:eastAsia="Times New Roman" w:hAnsi="Aptos Narrow" w:cs="Times New Roman"/>
+                <w:color w:val="000000"/>
+                <w:kern w:val="0"/>
+                <w:lang w:val="en-SE" w:eastAsia="en-SE"/>
+                <w14:ligatures w14:val="none"/>
+              </w:rPr>
+            </w:pPr>
+            <w:r>
+              <w:rPr>
+                <w:rFonts w:ascii="Aptos Narrow" w:eastAsia="Times New Roman" w:hAnsi="Aptos Narrow" w:cs="Times New Roman"/>
+                <w:color w:val="000000"/>
+                <w:kern w:val="0"/>
+                <w:lang w:val="en-SE" w:eastAsia="en-SE"/>
+                <w14:ligatures w14:val="none"/>
+              </w:rPr>
+              <w:t>Damage multiplier when a hit crits.</w:t>
+            </w:r>
+          </w:p>
+        </w:tc>
+      </w:tr>
+      <w:tr>
+        <w:trPr>
+          <w:trHeight w:val="300"/>
+        </w:trPr>
+        <w:tc>
+          <w:tcPr>
+            <w:tcW w:w="2689" w:type="dxa"/>
+            <w:tcBorders>
+              <w:top w:val="nil"/>
+              <w:left w:val="single" w:sz="4" w:space="0" w:color="000000"/>
+              <w:bottom w:val="single" w:sz="4" w:space="0" w:color="000000"/>
+              <w:right w:val="single" w:sz="4" w:space="0" w:color="000000"/>
+            </w:tcBorders>
+            <w:vAlign w:val="center"/>
+            <w:hideMark/>
+          </w:tcPr>
+          <w:p>
+            <w:pPr>
+              <w:spacing w:after="0" w:line="240" w:lineRule="auto"/>
+              <w:rPr>
+                <w:rFonts w:ascii="Aptos Narrow" w:eastAsia="Times New Roman" w:hAnsi="Aptos Narrow" w:cs="Times New Roman"/>
+                <w:b/>
+                <w:bCs/>
+                <w:color w:val="000000"/>
+                <w:kern w:val="0"/>
+                <w:lang w:val="en-SE" w:eastAsia="en-SE"/>
+                <w14:ligatures w14:val="none"/>
+              </w:rPr>
+            </w:pPr>
+            <w:r>
+              <w:rPr>
+                <w:rFonts w:ascii="Aptos Narrow" w:eastAsia="Times New Roman" w:hAnsi="Aptos Narrow" w:cs="Times New Roman"/>
+                <w:b/>
+                <w:bCs/>
+                <w:color w:val="000000"/>
+                <w:kern w:val="0"/>
+                <w:lang w:val="en-SE" w:eastAsia="en-SE"/>
+                <w14:ligatures w14:val="none"/>
+              </w:rPr>
+              <w:t>speed</w:t>
+            </w:r>
+          </w:p>
+        </w:tc>
+        <w:tc>
+          <w:tcPr>
+            <w:tcW w:w="2894" w:type="dxa"/>
+            <w:tcBorders>
+              <w:top w:val="nil"/>
+              <w:left w:val="nil"/>
+              <w:bottom w:val="single" w:sz="4" w:space="0" w:color="000000"/>
+              <w:right w:val="single" w:sz="4" w:space="0" w:color="000000"/>
+            </w:tcBorders>
+            <w:vAlign w:val="center"/>
+            <w:hideMark/>
+          </w:tcPr>
+          <w:p>
+            <w:pPr>
+              <w:spacing w:after="0" w:line="240" w:lineRule="auto"/>
+              <w:rPr>
+                <w:rFonts w:ascii="Aptos Narrow" w:eastAsia="Times New Roman" w:hAnsi="Aptos Narrow" w:cs="Times New Roman"/>
+                <w:b/>
+                <w:bCs/>
+                <w:color w:val="000000"/>
+                <w:kern w:val="0"/>
+                <w:lang w:val="en-SE" w:eastAsia="en-SE"/>
+                <w14:ligatures w14:val="none"/>
+              </w:rPr>
+            </w:pPr>
+            <w:r>
+              <w:rPr>
+                <w:rFonts w:ascii="Aptos Narrow" w:eastAsia="Times New Roman" w:hAnsi="Aptos Narrow" w:cs="Times New Roman"/>
+                <w:b/>
+                <w:bCs/>
+                <w:color w:val="000000"/>
+                <w:kern w:val="0"/>
+                <w:lang w:val="en-SE" w:eastAsia="en-SE"/>
+                <w14:ligatures w14:val="none"/>
+              </w:rPr>
+              <w:t>weight</w:t>
+            </w:r>
+          </w:p>
+        </w:tc>
+        <w:tc>
+          <w:tcPr>
+            <w:tcW w:w="1940" w:type="dxa"/>
+            <w:tcBorders>
+              <w:top w:val="nil"/>
+              <w:left w:val="nil"/>
+              <w:bottom w:val="single" w:sz="4" w:space="0" w:color="000000"/>
+              <w:right w:val="single" w:sz="4" w:space="0" w:color="000000"/>
+            </w:tcBorders>
+            <w:vAlign w:val="center"/>
+            <w:hideMark/>
+          </w:tcPr>
+          <w:p>
+            <w:pPr>
+              <w:spacing w:after="0" w:line="240" w:lineRule="auto"/>
+              <w:rPr>
+                <w:rFonts w:ascii="Aptos Narrow" w:eastAsia="Times New Roman" w:hAnsi="Aptos Narrow" w:cs="Times New Roman"/>
+                <w:b/>
+                <w:bCs/>
+                <w:color w:val="000000"/>
+                <w:kern w:val="0"/>
+                <w:lang w:val="en-SE" w:eastAsia="en-SE"/>
+                <w14:ligatures w14:val="none"/>
+              </w:rPr>
+            </w:pPr>
+            <w:r>
+              <w:rPr>
+                <w:rFonts w:ascii="Aptos Narrow" w:eastAsia="Times New Roman" w:hAnsi="Aptos Narrow" w:cs="Times New Roman"/>
+                <w:b/>
+                <w:bCs/>
+                <w:color w:val="000000"/>
+                <w:kern w:val="0"/>
+                <w:lang w:val="en-SE" w:eastAsia="en-SE"/>
+                <w14:ligatures w14:val="none"/>
+              </w:rPr>
+              <w:t>splash</w:t>
+            </w:r>
+          </w:p>
+        </w:tc>
+        <w:tc>
+          <w:tcPr>
+            <w:tcW w:w="1940" w:type="dxa"/>
+            <w:tcBorders>
+              <w:top w:val="nil"/>
+              <w:left w:val="nil"/>
+              <w:bottom w:val="single" w:sz="4" w:space="0" w:color="000000"/>
+              <w:right w:val="single" w:sz="4" w:space="0" w:color="000000"/>
+            </w:tcBorders>
+            <w:vAlign w:val="center"/>
+            <w:hideMark/>
+          </w:tcPr>
+          <w:p>
+            <w:pPr>
+              <w:spacing w:after="0" w:line="240" w:lineRule="auto"/>
+              <w:rPr>
+                <w:rFonts w:ascii="Aptos Narrow" w:eastAsia="Times New Roman" w:hAnsi="Aptos Narrow" w:cs="Times New Roman"/>
+                <w:b/>
+                <w:bCs/>
+                <w:color w:val="000000"/>
+                <w:kern w:val="0"/>
+                <w:lang w:val="en-SE" w:eastAsia="en-SE"/>
+                <w14:ligatures w14:val="none"/>
+              </w:rPr>
+            </w:pPr>
+            <w:r>
+              <w:rPr>
+                <w:rFonts w:ascii="Aptos Narrow" w:eastAsia="Times New Roman" w:hAnsi="Aptos Narrow" w:cs="Times New Roman"/>
+                <w:b/>
+                <w:bCs/>
+                <w:color w:val="000000"/>
+                <w:kern w:val="0"/>
+                <w:lang w:val="en-SE" w:eastAsia="en-SE"/>
+                <w14:ligatures w14:val="none"/>
+              </w:rPr>
+              <w:t>glyph_drop</w:t>
+            </w:r>
+          </w:p>
+        </w:tc>
+      </w:tr>
+      <w:tr>
+        <w:trPr>
+          <w:trHeight w:val="2700"/>
+        </w:trPr>
+        <w:tc>
+          <w:tcPr>
+            <w:tcW w:w="2689" w:type="dxa"/>
+            <w:tcBorders>
+              <w:top w:val="nil"/>
+              <w:left w:val="single" w:sz="4" w:space="0" w:color="000000"/>
+              <w:bottom w:val="single" w:sz="4" w:space="0" w:color="000000"/>
+              <w:right w:val="single" w:sz="4" w:space="0" w:color="000000"/>
+            </w:tcBorders>
+            <w:vAlign w:val="center"/>
+            <w:hideMark/>
+          </w:tcPr>
+          <w:p>
+            <w:pPr>
+              <w:spacing w:after="0" w:line="240" w:lineRule="auto"/>
+              <w:rPr>
+                <w:rFonts w:ascii="Aptos Narrow" w:eastAsia="Times New Roman" w:hAnsi="Aptos Narrow" w:cs="Times New Roman"/>
+                <w:color w:val="000000"/>
+                <w:kern w:val="0"/>
+                <w:lang w:val="en-SE" w:eastAsia="en-SE"/>
+                <w14:ligatures w14:val="none"/>
+              </w:rPr>
+            </w:pPr>
+            <w:r>
+              <w:rPr>
+                <w:rFonts w:ascii="Aptos Narrow" w:eastAsia="Times New Roman" w:hAnsi="Aptos Narrow" w:cs="Times New Roman"/>
+                <w:color w:val="000000"/>
+                <w:kern w:val="0"/>
+                <w:lang w:val="en-SE" w:eastAsia="en-SE"/>
+                <w14:ligatures w14:val="none"/>
+              </w:rPr>
+              <w:t>How fast the orb travels.</w:t>
+            </w:r>
+          </w:p>
+        </w:tc>
+        <w:tc>
+          <w:tcPr>
+            <w:tcW w:w="2894" w:type="dxa"/>
+            <w:tcBorders>
+              <w:top w:val="nil"/>
+              <w:left w:val="nil"/>
+              <w:bottom w:val="single" w:sz="4" w:space="0" w:color="000000"/>
+              <w:right w:val="single" w:sz="4" w:space="0" w:color="000000"/>
+            </w:tcBorders>
+            <w:vAlign w:val="center"/>
+            <w:hideMark/>
+          </w:tcPr>
+          <w:p>
+            <w:pPr>
+              <w:spacing w:after="0" w:line="240" w:lineRule="auto"/>
+              <w:rPr>
+                <w:rFonts w:ascii="Aptos Narrow" w:eastAsia="Times New Roman" w:hAnsi="Aptos Narrow" w:cs="Times New Roman"/>
+                <w:color w:val="000000"/>
+                <w:kern w:val="0"/>
+                <w:lang w:val="en-SE" w:eastAsia="en-SE"/>
+                <w14:ligatures w14:val="none"/>
+              </w:rPr>
+            </w:pPr>
+            <w:r>
+              <w:rPr>
+                <w:rFonts w:ascii="Aptos Narrow" w:eastAsia="Times New Roman" w:hAnsi="Aptos Narrow" w:cs="Times New Roman"/>
+                <w:color w:val="000000"/>
+                <w:kern w:val="0"/>
+                <w:lang w:val="en-SE" w:eastAsia="en-SE"/>
+                <w14:ligatures w14:val="none"/>
+              </w:rPr>
+              <w:t>Knockback distance (px). Bowling collisions deal this as damage to both enemies; breakables take +5% damage per point.</w:t>
+            </w:r>
+          </w:p>
+        </w:tc>
+        <w:tc>
+          <w:tcPr>
+            <w:tcW w:w="1940" w:type="dxa"/>
+            <w:tcBorders>
+              <w:top w:val="nil"/>
+              <w:left w:val="nil"/>
+              <w:bottom w:val="single" w:sz="4" w:space="0" w:color="000000"/>
+              <w:right w:val="single" w:sz="4" w:space="0" w:color="000000"/>
+            </w:tcBorders>
+            <w:vAlign w:val="center"/>
+            <w:hideMark/>
+          </w:tcPr>
+          <w:p>
+            <w:pPr>
+              <w:spacing w:after="0" w:line="240" w:lineRule="auto"/>
+              <w:rPr>
+                <w:rFonts w:ascii="Aptos Narrow" w:eastAsia="Times New Roman" w:hAnsi="Aptos Narrow" w:cs="Times New Roman"/>
+                <w:color w:val="000000"/>
+                <w:kern w:val="0"/>
+                <w:lang w:val="en-SE" w:eastAsia="en-SE"/>
+                <w14:ligatures w14:val="none"/>
+              </w:rPr>
+            </w:pPr>
+            <w:r>
+              <w:rPr>
+                <w:rFonts w:ascii="Aptos Narrow" w:eastAsia="Times New Roman" w:hAnsi="Aptos Narrow" w:cs="Times New Roman"/>
+                <w:color w:val="000000"/>
+                <w:kern w:val="0"/>
+                <w:lang w:val="en-SE" w:eastAsia="en-SE"/>
+                <w14:ligatures w14:val="none"/>
+              </w:rPr>
+              <w:t>Percent of resolved hit damage applied to others within 50 px.</w:t>
+            </w:r>
+          </w:p>
+        </w:tc>
+        <w:tc>
+          <w:tcPr>
+            <w:tcW w:w="1940" w:type="dxa"/>
+            <w:tcBorders>
+              <w:top w:val="nil"/>
+              <w:left w:val="nil"/>
+              <w:bottom w:val="single" w:sz="4" w:space="0" w:color="000000"/>
+              <w:right w:val="single" w:sz="4" w:space="0" w:color="000000"/>
+            </w:tcBorders>
+            <w:vAlign w:val="center"/>
+            <w:hideMark/>
+          </w:tcPr>
+          <w:p>
+            <w:pPr>
+              <w:spacing w:after="0" w:line="240" w:lineRule="auto"/>
+              <w:rPr>
+                <w:rFonts w:ascii="Aptos Narrow" w:eastAsia="Times New Roman" w:hAnsi="Aptos Narrow" w:cs="Times New Roman"/>
+                <w:color w:val="000000"/>
+                <w:kern w:val="0"/>
+                <w:lang w:val="en-SE" w:eastAsia="en-SE"/>
+                <w14:ligatures w14:val="none"/>
+              </w:rPr>
+            </w:pPr>
+            <w:r>
+              <w:rPr>
+                <w:rFonts w:ascii="Aptos Narrow" w:eastAsia="Times New Roman" w:hAnsi="Aptos Narrow" w:cs="Times New Roman"/>
+                <w:color w:val="000000"/>
+                <w:kern w:val="0"/>
+                <w:lang w:val="en-SE" w:eastAsia="en-SE"/>
+                <w14:ligatures w14:val="none"/>
+              </w:rPr>
+              <w:t>Chance a glyph drops when this orb gets the kill.</w:t>
+            </w:r>
+          </w:p>
+        </w:tc>
+      </w:tr>
+      <w:tr>
+        <w:trPr>
+          <w:trHeight w:val="300"/>
+        </w:trPr>
+        <w:tc>
+          <w:tcPr>
+            <w:tcW w:w="2689" w:type="dxa"/>
+            <w:tcBorders>
+              <w:top w:val="nil"/>
+              <w:left w:val="single" w:sz="4" w:space="0" w:color="000000"/>
+              <w:bottom w:val="single" w:sz="4" w:space="0" w:color="000000"/>
+              <w:right w:val="single" w:sz="4" w:space="0" w:color="000000"/>
+            </w:tcBorders>
+            <w:vAlign w:val="center"/>
+            <w:hideMark/>
+          </w:tcPr>
+          <w:p>
+            <w:pPr>
+              <w:spacing w:after="0" w:line="240" w:lineRule="auto"/>
+              <w:rPr>
+                <w:rFonts w:ascii="Aptos Narrow" w:eastAsia="Times New Roman" w:hAnsi="Aptos Narrow" w:cs="Times New Roman"/>
+                <w:b/>
+                <w:bCs/>
+                <w:color w:val="000000"/>
+                <w:kern w:val="0"/>
+                <w:lang w:val="en-SE" w:eastAsia="en-SE"/>
+                <w14:ligatures w14:val="none"/>
+              </w:rPr>
+            </w:pPr>
+            <w:r>
+              <w:rPr>
+                <w:rFonts w:ascii="Aptos Narrow" w:eastAsia="Times New Roman" w:hAnsi="Aptos Narrow" w:cs="Times New Roman"/>
+                <w:b/>
+                <w:bCs/>
+                <w:color w:val="000000"/>
+                <w:kern w:val="0"/>
+                <w:lang w:val="en-SE" w:eastAsia="en-SE"/>
+                <w14:ligatures w14:val="none"/>
+              </w:rPr>
+              <w:t>burn</w:t>
+            </w:r>
+          </w:p>
+        </w:tc>
+        <w:tc>
+          <w:tcPr>
+            <w:tcW w:w="2894" w:type="dxa"/>
+            <w:tcBorders>
+              <w:top w:val="nil"/>
+              <w:left w:val="nil"/>
+              <w:bottom w:val="single" w:sz="4" w:space="0" w:color="000000"/>
+              <w:right w:val="single" w:sz="4" w:space="0" w:color="000000"/>
+            </w:tcBorders>
+            <w:vAlign w:val="center"/>
+            <w:hideMark/>
+          </w:tcPr>
+          <w:p>
+            <w:pPr>
+              <w:spacing w:after="0" w:line="240" w:lineRule="auto"/>
+              <w:rPr>
+                <w:rFonts w:ascii="Aptos Narrow" w:eastAsia="Times New Roman" w:hAnsi="Aptos Narrow" w:cs="Times New Roman"/>
+                <w:b/>
+                <w:bCs/>
+                <w:color w:val="000000"/>
+                <w:kern w:val="0"/>
+                <w:lang w:val="en-SE" w:eastAsia="en-SE"/>
+                <w14:ligatures w14:val="none"/>
+              </w:rPr>
+            </w:pPr>
+            <w:r>
+              <w:rPr>
+                <w:rFonts w:ascii="Aptos Narrow" w:eastAsia="Times New Roman" w:hAnsi="Aptos Narrow" w:cs="Times New Roman"/>
+                <w:b/>
+                <w:bCs/>
+                <w:color w:val="000000"/>
+                <w:kern w:val="0"/>
+                <w:lang w:val="en-SE" w:eastAsia="en-SE"/>
+                <w14:ligatures w14:val="none"/>
+              </w:rPr>
+              <w:t>chill</w:t>
+            </w:r>
+          </w:p>
+        </w:tc>
+        <w:tc>
+          <w:tcPr>
+            <w:tcW w:w="1940" w:type="dxa"/>
+            <w:tcBorders>
+              <w:top w:val="nil"/>
+              <w:left w:val="nil"/>
+              <w:bottom w:val="single" w:sz="4" w:space="0" w:color="000000"/>
+              <w:right w:val="single" w:sz="4" w:space="0" w:color="000000"/>
+            </w:tcBorders>
+            <w:vAlign w:val="center"/>
+            <w:hideMark/>
+          </w:tcPr>
+          <w:p>
+            <w:pPr>
+              <w:spacing w:after="0" w:line="240" w:lineRule="auto"/>
+              <w:rPr>
+                <w:rFonts w:ascii="Aptos Narrow" w:eastAsia="Times New Roman" w:hAnsi="Aptos Narrow" w:cs="Times New Roman"/>
+                <w:b/>
+                <w:bCs/>
+                <w:color w:val="000000"/>
+                <w:kern w:val="0"/>
+                <w:lang w:val="en-SE" w:eastAsia="en-SE"/>
+                <w14:ligatures w14:val="none"/>
+              </w:rPr>
+            </w:pPr>
+            <w:r>
+              <w:rPr>
+                <w:rFonts w:ascii="Aptos Narrow" w:eastAsia="Times New Roman" w:hAnsi="Aptos Narrow" w:cs="Times New Roman"/>
+                <w:b/>
+                <w:bCs/>
+                <w:color w:val="000000"/>
+                <w:kern w:val="0"/>
+                <w:lang w:val="en-SE" w:eastAsia="en-SE"/>
+                <w14:ligatures w14:val="none"/>
+              </w:rPr>
+              <w:t>shock</w:t>
+            </w:r>
+          </w:p>
+        </w:tc>
+        <w:tc>
+          <w:tcPr>
+            <w:tcW w:w="1940" w:type="dxa"/>
+            <w:tcBorders>
+              <w:top w:val="nil"/>
+              <w:left w:val="nil"/>
+              <w:bottom w:val="single" w:sz="4" w:space="0" w:color="000000"/>
+              <w:right w:val="single" w:sz="4" w:space="0" w:color="000000"/>
+            </w:tcBorders>
+            <w:vAlign w:val="center"/>
+            <w:hideMark/>
+          </w:tcPr>
+          <w:p>
+            <w:pPr>
+              <w:spacing w:after="0" w:line="240" w:lineRule="auto"/>
+              <w:rPr>
+                <w:rFonts w:ascii="Aptos Narrow" w:eastAsia="Times New Roman" w:hAnsi="Aptos Narrow" w:cs="Times New Roman"/>
+                <w:b/>
+                <w:bCs/>
+                <w:color w:val="000000"/>
+                <w:kern w:val="0"/>
+                <w:lang w:val="en-SE" w:eastAsia="en-SE"/>
+                <w14:ligatures w14:val="none"/>
+              </w:rPr>
+            </w:pPr>
+            <w:r>
+              <w:rPr>
+                <w:rFonts w:ascii="Aptos Narrow" w:eastAsia="Times New Roman" w:hAnsi="Aptos Narrow" w:cs="Times New Roman"/>
+                <w:b/>
+                <w:bCs/>
+                <w:color w:val="000000"/>
+                <w:kern w:val="0"/>
+                <w:lang w:val="en-SE" w:eastAsia="en-SE"/>
+                <w14:ligatures w14:val="none"/>
+              </w:rPr>
+              <w:t>poison</w:t>
+            </w:r>
+          </w:p>
+        </w:tc>
+      </w:tr>
+      <w:tr>
+        <w:trPr>
+          <w:trHeight w:val="1800"/>
+        </w:trPr>
+        <w:tc>
+          <w:tcPr>
+            <w:tcW w:w="2689" w:type="dxa"/>
+            <w:tcBorders>
+              <w:top w:val="nil"/>
+              <w:left w:val="single" w:sz="4" w:space="0" w:color="000000"/>
+              <w:bottom w:val="single" w:sz="4" w:space="0" w:color="000000"/>
+              <w:right w:val="single" w:sz="4" w:space="0" w:color="000000"/>
+            </w:tcBorders>
+            <w:vAlign w:val="center"/>
+            <w:hideMark/>
+          </w:tcPr>
+          <w:p>
+            <w:pPr>
+              <w:spacing w:after="0" w:line="240" w:lineRule="auto"/>
+              <w:rPr>
+                <w:rFonts w:ascii="Aptos Narrow" w:eastAsia="Times New Roman" w:hAnsi="Aptos Narrow" w:cs="Times New Roman"/>
+                <w:color w:val="000000"/>
+                <w:kern w:val="0"/>
+                <w:lang w:val="en-SE" w:eastAsia="en-SE"/>
+                <w14:ligatures w14:val="none"/>
+              </w:rPr>
+            </w:pPr>
+            <w:r>
+              <w:rPr>
+                <w:rFonts w:ascii="Aptos Narrow" w:eastAsia="Times New Roman" w:hAnsi="Aptos Narrow" w:cs="Times New Roman"/>
+                <w:color w:val="000000"/>
+                <w:kern w:val="0"/>
+                <w:lang w:val="en-SE" w:eastAsia="en-SE"/>
+                <w14:ligatures w14:val="none"/>
+              </w:rPr>
+              <w:t>Stacks on enemy hit. On death, explodes for 5 × stacks in a radius of 50 × (1 + 5% × stacks) px.</w:t>
+            </w:r>
+          </w:p>
+        </w:tc>
+        <w:tc>
+          <w:tcPr>
+            <w:tcW w:w="2894" w:type="dxa"/>
+            <w:tcBorders>
+              <w:top w:val="nil"/>
+              <w:left w:val="nil"/>
+              <w:bottom w:val="single" w:sz="4" w:space="0" w:color="000000"/>
+              <w:right w:val="single" w:sz="4" w:space="0" w:color="000000"/>
+            </w:tcBorders>
+            <w:vAlign w:val="center"/>
+            <w:hideMark/>
+          </w:tcPr>
+          <w:p>
+            <w:pPr>
+              <w:spacing w:after="0" w:line="240" w:lineRule="auto"/>
+              <w:rPr>
+                <w:rFonts w:ascii="Aptos Narrow" w:eastAsia="Times New Roman" w:hAnsi="Aptos Narrow" w:cs="Times New Roman"/>
+                <w:color w:val="000000"/>
+                <w:kern w:val="0"/>
+                <w:lang w:val="en-SE" w:eastAsia="en-SE"/>
+                <w14:ligatures w14:val="none"/>
+              </w:rPr>
+            </w:pPr>
+            <w:r>
+              <w:rPr>
+                <w:rFonts w:ascii="Aptos Narrow" w:eastAsia="Times New Roman" w:hAnsi="Aptos Narrow" w:cs="Times New Roman"/>
+                <w:color w:val="000000"/>
+                <w:kern w:val="0"/>
+                <w:lang w:val="en-SE" w:eastAsia="en-SE"/>
+                <w14:ligatures w14:val="none"/>
+              </w:rPr>
+              <w:t>Stacks on enemy hit. +5% move and attack-speed slow per stack (capped at 90%).</w:t>
+            </w:r>
+          </w:p>
+        </w:tc>
+        <w:tc>
+          <w:tcPr>
+            <w:tcW w:w="1940" w:type="dxa"/>
+            <w:tcBorders>
+              <w:top w:val="nil"/>
+              <w:left w:val="nil"/>
+              <w:bottom w:val="single" w:sz="4" w:space="0" w:color="000000"/>
+              <w:right w:val="single" w:sz="4" w:space="0" w:color="000000"/>
+            </w:tcBorders>
+            <w:vAlign w:val="center"/>
+            <w:hideMark/>
+          </w:tcPr>
+          <w:p>
+            <w:pPr>
+              <w:spacing w:after="0" w:line="240" w:lineRule="auto"/>
+              <w:rPr>
+                <w:rFonts w:ascii="Aptos Narrow" w:eastAsia="Times New Roman" w:hAnsi="Aptos Narrow" w:cs="Times New Roman"/>
+                <w:color w:val="000000"/>
+                <w:kern w:val="0"/>
+                <w:lang w:val="en-SE" w:eastAsia="en-SE"/>
+                <w14:ligatures w14:val="none"/>
+              </w:rPr>
+            </w:pPr>
+            <w:r>
+              <w:rPr>
+                <w:rFonts w:ascii="Aptos Narrow" w:eastAsia="Times New Roman" w:hAnsi="Aptos Narrow" w:cs="Times New Roman"/>
+                <w:color w:val="000000"/>
+                <w:kern w:val="0"/>
+                <w:lang w:val="en-SE" w:eastAsia="en-SE"/>
+                <w14:ligatures w14:val="none"/>
+              </w:rPr>
+              <w:t>Stacks on enemy hit. At 10 stacks: 50 damage, 2 s stun, then stacks clear.</w:t>
+            </w:r>
+          </w:p>
+        </w:tc>
+        <w:tc>
+          <w:tcPr>
+            <w:tcW w:w="1940" w:type="dxa"/>
+            <w:tcBorders>
+              <w:top w:val="nil"/>
+              <w:left w:val="nil"/>
+              <w:bottom w:val="single" w:sz="4" w:space="0" w:color="000000"/>
+              <w:right w:val="single" w:sz="4" w:space="0" w:color="000000"/>
+            </w:tcBorders>
+            <w:vAlign w:val="center"/>
+            <w:hideMark/>
+          </w:tcPr>
+          <w:p>
+            <w:pPr>
+              <w:spacing w:after="0" w:line="240" w:lineRule="auto"/>
+              <w:rPr>
+                <w:rFonts w:ascii="Aptos Narrow" w:eastAsia="Times New Roman" w:hAnsi="Aptos Narrow" w:cs="Times New Roman"/>
+                <w:color w:val="000000"/>
+                <w:kern w:val="0"/>
+                <w:lang w:val="en-SE" w:eastAsia="en-SE"/>
+                <w14:ligatures w14:val="none"/>
+              </w:rPr>
+            </w:pPr>
+            <w:r>
+              <w:rPr>
+                <w:rFonts w:ascii="Aptos Narrow" w:eastAsia="Times New Roman" w:hAnsi="Aptos Narrow" w:cs="Times New Roman"/>
+                <w:color w:val="000000"/>
+                <w:kern w:val="0"/>
+                <w:lang w:val="en-SE" w:eastAsia="en-SE"/>
+                <w14:ligatures w14:val="none"/>
+              </w:rPr>
+              <w:t>Stacks on enemy hit. 1 damage per stack per second until the enemy dies.</w:t>
+            </w:r>
+          </w:p>
+        </w:tc>
+      </w:tr>
+    </w:tbl>
+    <w:p>
+      <w:pPr>
+        <w:rPr>
+          <w:lang w:val="en-SE"/>
+        </w:rPr>
+      </w:pPr>
       <w:r>
         <w:rPr>
           <w:lang w:val="en-SE"/>
         </w:rPr>
         <w:br/>
-        <w:t xml:space="preserve">Enemies will also drop </w:t>
-      </w:r>
-      <w:r>
-        <w:rPr>
-          <w:lang w:val="en-SE"/>
-        </w:rPr>
-        <w:t>mana</w:t>
-      </w:r>
-      <w:r>
-        <w:rPr>
-          <w:lang w:val="en-SE"/>
-        </w:rPr>
-        <w:t xml:space="preserve"> which the player can pickup. But the </w:t>
-      </w:r>
-      <w:r>
-        <w:rPr>
-          <w:lang w:val="en-SE"/>
-        </w:rPr>
-        <w:t>mana</w:t>
-      </w:r>
-      <w:r>
-        <w:rPr>
-          <w:lang w:val="en-SE"/>
-        </w:rPr>
-        <w:t xml:space="preserve"> disappears after a while so you need to be fast.</w:t>
       </w:r>
     </w:p>
     <w:p>
       <w:pPr>
         <w:rPr>
-          <w:lang w:val="en-US"/>
+          <w:lang w:val="en-SE"/>
         </w:rPr>
       </w:pPr>
     </w:p>
@@ -480,95 +1416,266 @@
       <w:pPr>
         <w:pStyle w:val="Heading2"/>
         <w:rPr>
-          <w:lang w:val="en-US"/>
-        </w:rPr>
-      </w:pPr>
-      <w:r>
-        <w:rPr>
-          <w:lang w:val="en-US"/>
-        </w:rPr>
-        <w:lastRenderedPageBreak/>
-        <w:t>Progression</w:t>
+          <w:lang w:val="en-SE"/>
+        </w:rPr>
+      </w:pPr>
+      <w:r>
+        <w:rPr>
+          <w:lang w:val="en-SE"/>
+        </w:rPr>
+        <w:t>Stage</w:t>
       </w:r>
     </w:p>
     <w:p>
       <w:pPr>
         <w:rPr>
-          <w:lang w:val="en-US"/>
-        </w:rPr>
-      </w:pPr>
-      <w:r>
-        <w:rPr>
-          <w:lang w:val="en-US"/>
-        </w:rPr>
-        <w:t xml:space="preserve">After each level the player enters a </w:t>
-      </w:r>
-      <w:r>
-        <w:rPr>
-          <w:lang w:val="en-US"/>
-        </w:rPr>
-        <w:t>“</w:t>
-      </w:r>
-      <w:r>
-        <w:rPr>
-          <w:lang w:val="en-US"/>
-        </w:rPr>
-        <w:t>shop</w:t>
-      </w:r>
-      <w:r>
-        <w:rPr>
-          <w:lang w:val="en-US"/>
-        </w:rPr>
-        <w:t>”</w:t>
-      </w:r>
-      <w:r>
-        <w:rPr>
-          <w:lang w:val="en-US"/>
-        </w:rPr>
-        <w:t xml:space="preserve"> where they can spend</w:t>
-      </w:r>
-      <w:r>
-        <w:rPr>
-          <w:lang w:val="en-US"/>
-        </w:rPr>
-        <w:t xml:space="preserve"> mana</w:t>
-      </w:r>
-      <w:r>
-        <w:rPr>
-          <w:lang w:val="en-US"/>
-        </w:rPr>
-        <w:t xml:space="preserve"> on various randomized upgrades. It can be things that improve the bullet, or the player, or curses the enemies somehow. Much of the fun should be in finding interesting synergies.</w:t>
-      </w:r>
-      <w:r>
-        <w:rPr>
-          <w:lang w:val="en-US"/>
-        </w:rPr>
-        <w:br/>
+          <w:lang w:val="en-SE"/>
+        </w:rPr>
+      </w:pPr>
+      <w:r>
+        <w:rPr>
+          <w:lang w:val="en-SE"/>
+        </w:rPr>
+        <w:t xml:space="preserve">There will be different stages and environment, with </w:t>
+      </w:r>
+      <w:r>
+        <w:rPr>
+          <w:lang w:val="en-SE"/>
+        </w:rPr>
+        <w:t>randomized enemies</w:t>
+      </w:r>
+      <w:r>
+        <w:rPr>
+          <w:lang w:val="en-SE"/>
+        </w:rPr>
+        <w:t xml:space="preserve"> and </w:t>
+      </w:r>
+      <w:r>
+        <w:rPr>
+          <w:lang w:val="en-SE"/>
+        </w:rPr>
+        <w:t>obstacles</w:t>
+      </w:r>
+      <w:r>
+        <w:rPr>
+          <w:lang w:val="en-SE"/>
+        </w:rPr>
+        <w:t xml:space="preserve">. Various obstacles interact with the </w:t>
+      </w:r>
+      <w:r>
+        <w:rPr>
+          <w:lang w:val="en-SE"/>
+        </w:rPr>
+        <w:t>orb</w:t>
+      </w:r>
+      <w:r>
+        <w:rPr>
+          <w:lang w:val="en-SE"/>
+        </w:rPr>
+        <w:t xml:space="preserve"> and the environment. For example, a barrel of TNT can explode.</w:t>
+      </w:r>
+      <w:r>
+        <w:rPr>
+          <w:lang w:val="en-SE"/>
+        </w:rPr>
+        <w:t xml:space="preserve"> Rocks can be broken.</w:t>
       </w:r>
     </w:p>
     <w:p>
       <w:pPr>
         <w:rPr>
-          <w:rStyle w:val="Heading2Char"/>
-          <w:lang w:val="en-US"/>
-        </w:rPr>
-      </w:pPr>
-      <w:r>
-        <w:rPr>
-          <w:lang w:val="en-US"/>
-        </w:rPr>
-        <w:br/>
-      </w:r>
-      <w:r>
-        <w:rPr>
-          <w:rStyle w:val="Heading2Char"/>
-          <w:lang w:val="en-US"/>
-        </w:rPr>
-        <w:t>Enemies</w:t>
-      </w:r>
+          <w:lang w:val="en-US"/>
+        </w:rPr>
+      </w:pPr>
     </w:p>
     <w:p>
       <w:pPr>
+        <w:pStyle w:val="Heading2"/>
+        <w:rPr>
+          <w:lang w:val="en-SE"/>
+        </w:rPr>
+      </w:pPr>
+      <w:r>
+        <w:rPr>
+          <w:lang w:val="en-SE"/>
+        </w:rPr>
+        <w:t>Glyphs</w:t>
+      </w:r>
+    </w:p>
+    <w:p>
+      <w:pPr>
+        <w:rPr>
+          <w:lang w:val="en-SE"/>
+        </w:rPr>
+      </w:pPr>
+      <w:r>
+        <w:rPr>
+          <w:lang w:val="en-SE"/>
+        </w:rPr>
+        <w:t>Enemies and obstacles drop Glyphs. These come in 12 different types and divided into four different elements. The player can pick these up and throw them into the summoning circle to store them. A player can have maximum of 3 stored at once. Every extra gets converted into mana.</w:t>
+      </w:r>
+      <w:r>
+        <w:rPr>
+          <w:lang w:val="en-SE"/>
+        </w:rPr>
+        <w:br/>
+      </w:r>
+      <w:r>
+        <w:rPr>
+          <w:lang w:val="en-SE"/>
+        </w:rPr>
+        <w:br/>
+        <w:t>Glyphs can be put into orbs to give them a boost</w:t>
+      </w:r>
+      <w:r>
+        <w:rPr>
+          <w:lang w:val="en-SE"/>
+        </w:rPr>
+        <w:t xml:space="preserve"> to one of its 12 attributes. If three glyphs are added, a Blank orb can be upgraded to one of 20 other orbs that all have special effects.</w:t>
+      </w:r>
+      <w:r>
+        <w:rPr>
+          <w:lang w:val="en-SE"/>
+        </w:rPr>
+        <w:br/>
+      </w:r>
+      <w:r>
+        <w:rPr>
+          <w:lang w:val="en-SE"/>
+        </w:rPr>
+        <w:lastRenderedPageBreak/>
+        <w:t>Glyphs can be of three different rarities: Common, Rare and Unique. This influences the attribute value added by it.</w:t>
+      </w:r>
+    </w:p>
+    <w:p>
+      <w:pPr>
+        <w:pStyle w:val="NoSpacing"/>
+        <w:rPr>
+          <w:lang w:val="en-US"/>
+        </w:rPr>
+      </w:pPr>
+      <w:r>
+        <w:rPr>
+          <w:rStyle w:val="Heading2Char"/>
+          <w:lang w:val="en-US"/>
+        </w:rPr>
+        <w:t>Progression</w:t>
+      </w:r>
+      <w:r>
+        <w:rPr>
+          <w:lang w:val="en-US"/>
+        </w:rPr>
+        <w:br/>
+      </w:r>
+      <w:r>
+        <w:rPr>
+          <w:lang w:val="en-US"/>
+        </w:rPr>
+        <w:br/>
+        <w:t>During the level t</w:t>
+      </w:r>
+      <w:r>
+        <w:rPr>
+          <w:lang w:val="en-US"/>
+        </w:rPr>
+        <w:t>he player can activate the summoning circle (first time free, after that price goes up by 5 mana). The next orb that enters the summoning circle opens up a menu where the player can see info about that orb, as well as an inventory at the bottom of the screen of all current orbs.</w:t>
+      </w:r>
+      <w:r>
+        <w:rPr>
+          <w:lang w:val="en-US"/>
+        </w:rPr>
+        <w:br/>
+        <w:t>In  this menu the player can</w:t>
+      </w:r>
+      <w:r>
+        <w:rPr>
+          <w:lang w:val="en-US"/>
+        </w:rPr>
+        <w:br/>
+      </w:r>
+      <w:r>
+        <w:rPr>
+          <w:lang w:val="en-US"/>
+        </w:rPr>
+        <w:br/>
+        <w:t xml:space="preserve">1. Put glyphs in orbs. If three glyphs are added to a Blank Orb the orb can be upgraded. </w:t>
+      </w:r>
+      <w:r>
+        <w:rPr>
+          <w:lang w:val="en-US"/>
+        </w:rPr>
+        <w:br/>
+        <w:t>If three glyphs are added to a non-Blank Orb it can with the right combination trigger a further upgrade, called Attunement. After adding two glyphs to a orb hints of the four possible</w:t>
+      </w:r>
+      <w:r>
+        <w:rPr>
+          <w:lang w:val="en-US"/>
+        </w:rPr>
+        <w:t xml:space="preserve"> Attunements are shown. “???” if not discovered yet and the name of the Attunement if it has been discovered already.</w:t>
+      </w:r>
+      <w:r>
+        <w:rPr>
+          <w:lang w:val="en-US"/>
+        </w:rPr>
+        <w:br/>
+      </w:r>
+      <w:r>
+        <w:rPr>
+          <w:lang w:val="en-US"/>
+        </w:rPr>
+        <w:br/>
+        <w:t>2. Recycle a glyph to get mana. 5 mana for a Common glyph, 10 for Rare and 20 for unique.</w:t>
+      </w:r>
+      <w:r>
+        <w:rPr>
+          <w:lang w:val="en-US"/>
+        </w:rPr>
+        <w:br/>
+      </w:r>
+    </w:p>
+    <w:p>
+      <w:pPr>
+        <w:pStyle w:val="NoSpacing"/>
+        <w:rPr>
+          <w:lang w:val="en-US"/>
+        </w:rPr>
+      </w:pPr>
+      <w:r>
+        <w:rPr>
+          <w:lang w:val="en-US"/>
+        </w:rPr>
+        <w:t>3. Buy a new Blank Orb for 20 mana. Price goes up by 10 each time.</w:t>
+      </w:r>
+      <w:r>
+        <w:rPr>
+          <w:lang w:val="en-US"/>
+        </w:rPr>
+        <w:br/>
+      </w:r>
+    </w:p>
+    <w:p>
+      <w:pPr>
+        <w:rPr>
+          <w:rStyle w:val="Heading2Char"/>
+          <w:lang w:val="en-US"/>
+        </w:rPr>
+      </w:pPr>
+      <w:r>
+        <w:rPr>
+          <w:lang w:val="en-US"/>
+        </w:rPr>
+        <w:br/>
+      </w:r>
+      <w:r>
+        <w:rPr>
+          <w:rStyle w:val="Heading2Char"/>
+          <w:lang w:val="en-US"/>
+        </w:rPr>
+        <w:t>Enemies</w:t>
+      </w:r>
+    </w:p>
+    <w:p>
+      <w:pPr>
         <w:rPr>
           <w:lang w:val="en-US"/>
         </w:rPr>
@@ -602,6 +1709,12 @@
           <w:lang w:val="en-US"/>
         </w:rPr>
         <w:t>on contact.</w:t>
+      </w:r>
+      <w:r>
+        <w:rPr>
+          <w:lang w:val="en-US"/>
+        </w:rPr>
+        <w:t xml:space="preserve"> Grunt and Brute.</w:t>
       </w:r>
     </w:p>
     <w:sectPr>
@@ -615,7 +1728,7 @@
 </file>
 
 <file path=word/numbering.xml><?xml version="1.0" encoding="utf-8"?>
-<w:numbering xmlns:wpc="http://schemas.microsoft.com/office/word/2010/wordprocessingCanvas" xmlns:cx="http://schemas.microsoft.com/office/drawing/2014/chartex" xmlns:cx1="http://schemas.microsoft.com/office/drawing/2015/9/8/chartex" xmlns:cx2="http://schemas.microsoft.com/office/drawing/2015/10/21/chartex" xmlns:cx3="http://schemas.microsoft.com/office/drawing/2016/5/9/chartex" xmlns:cx4="http://schemas.microsoft.com/office/drawing/2016/5/10/chartex" xmlns:cx5="http://schemas.microsoft.com/office/drawing/2016/5/11/chartex" xmlns:cx6="http://schemas.microsoft.com/office/drawing/2016/5/12/chartex" xmlns:cx7="http://schemas.microsoft.com/office/drawing/2016/5/13/chartex" xmlns:cx8="http://schemas.microsoft.com/office/drawing/2016/5/14/chartex" xmlns:mc="http://schemas.openxmlformats.org/markup-compatibility/2006" xmlns:aink="http://schemas.microsoft.com/office/drawing/2016/ink" xmlns:am3d="http://schemas.microsoft.com/office/drawing/2017/model3d" xmlns:o="urn:schemas-microsoft-com:office:office" xmlns:oel="http://schemas.microsoft.com/office/2019/extlst" xmlns:r="http://schemas.openxmlformats.org/officeDocument/2006/relationships" xmlns:m="http://schemas.openxmlformats.org/officeDocument/2006/math" xmlns:v="urn:schemas-microsoft-com:vml" xmlns:wp14="http://schemas.microsoft.com/office/word/2010/wordprocessingDrawing" xmlns:wp="http://schemas.openxmlformats.org/drawingml/2006/wordprocessingDrawing" xmlns:w10="urn:schemas-microsoft-com:office:word" xmlns:w="http://schemas.openxmlformats.org/wordprocessingml/2006/main" xmlns:w14="http://schemas.microsoft.com/office/word/2010/wordml" xmlns:w15="http://schemas.microsoft.com/office/word/2012/wordml" xmlns:w16cei="http://schemas.microsoft.com/office/word/2026/wordml/cei" xmlns:w16cex="http://schemas.microsoft.com/office/word/2018/wordml/cex" xmlns:w16cid="http://schemas.microsoft.com/office/word/2016/wordml/cid" xmlns:w16="http://schemas.microsoft.com/office/word/2018/wordml" xmlns:w16du="http://schemas.microsoft.com/office/word/2023/wordml/word16du" xmlns:w16sdtdh="http://schemas.microsoft.com/office/word/2020/wordml/sdtdatahash" xmlns:w16sdtfl="http://schemas.microsoft.com/office/word/2024/wordml/sdtformatlock" xmlns:w16se="http://schemas.microsoft.com/office/word/2015/wordml/symex" xmlns:wpg="http://schemas.microsoft.com/office/word/2010/wordprocessingGroup" xmlns:wpi="http://schemas.microsoft.com/office/word/2010/wordprocessingInk" xmlns:wne="http://schemas.microsoft.com/office/word/2006/wordml" xmlns:wps="http://schemas.microsoft.com/office/word/2010/wordprocessingShape" mc:Ignorable="w14 w15 w16se w16cid w16 w16cex w16sdtdh w16sdtfl w16du wp14">
+<w:numbering xmlns:wpc="http://schemas.microsoft.com/office/word/2010/wordprocessingCanvas" xmlns:cx="http://schemas.microsoft.com/office/drawing/2014/chartex" xmlns:cx1="http://schemas.microsoft.com/office/drawing/2015/9/8/chartex" xmlns:cx2="http://schemas.microsoft.com/office/drawing/2015/10/21/chartex" xmlns:cx3="http://schemas.microsoft.com/office/drawing/2016/5/9/chartex" xmlns:cx4="http://schemas.microsoft.com/office/drawing/2016/5/10/chartex" xmlns:cx5="http://schemas.microsoft.com/office/drawing/2016/5/11/chartex" xmlns:cx6="http://schemas.microsoft.com/office/drawing/2016/5/12/chartex" xmlns:cx7="http://schemas.microsoft.com/office/drawing/2016/5/13/chartex" xmlns:cx8="http://schemas.microsoft.com/office/drawing/2016/5/14/chartex" xmlns:mc="http://schemas.openxmlformats.org/markup-compatibility/2006" xmlns:aink="http://schemas.microsoft.com/office/drawing/2016/ink" xmlns:am3d="http://schemas.microsoft.com/office/drawing/2017/model3d" xmlns:o="urn:schemas-microsoft-com:office:office" xmlns:oel="http://schemas.microsoft.com/office/2019/extlst" xmlns:r="http://schemas.openxmlformats.org/officeDocument/2006/relationships" xmlns:m="http://schemas.openxmlformats.org/officeDocument/2006/math" xmlns:v="urn:schemas-microsoft-com:vml" xmlns:wp14="http://schemas.microsoft.com/office/word/2010/wordprocessingDrawing" xmlns:wp="http://schemas.openxmlformats.org/drawingml/2006/wordprocessingDrawing" xmlns:w10="urn:schemas-microsoft-com:office:word" xmlns:w="http://schemas.openxmlformats.org/wordprocessingml/2006/main" xmlns:w14="http://schemas.microsoft.com/office/word/2010/wordml" xmlns:w15="http://schemas.microsoft.com/office/word/2012/wordml" xmlns:w16cex="http://schemas.microsoft.com/office/word/2018/wordml/cex" xmlns:w16cid="http://schemas.microsoft.com/office/word/2016/wordml/cid" xmlns:w16="http://schemas.microsoft.com/office/word/2018/wordml" xmlns:w16du="http://schemas.microsoft.com/office/word/2023/wordml/word16du" xmlns:w16sdtdh="http://schemas.microsoft.com/office/word/2020/wordml/sdtdatahash" xmlns:w16sdtfl="http://schemas.microsoft.com/office/word/2024/wordml/sdtformatlock" xmlns:w16se="http://schemas.microsoft.com/office/word/2015/wordml/symex" xmlns:wpg="http://schemas.microsoft.com/office/word/2010/wordprocessingGroup" xmlns:wpi="http://schemas.microsoft.com/office/word/2010/wordprocessingInk" xmlns:wne="http://schemas.microsoft.com/office/word/2006/wordml" xmlns:wps="http://schemas.microsoft.com/office/word/2010/wordprocessingShape" mc:Ignorable="w14 w15 w16se w16cid w16 w16cex w16sdtdh w16sdtfl w16du wp14">
   <w:abstractNum w:abstractNumId="0" w15:restartNumberingAfterBreak="0">
     <w:nsid w:val="49852991"/>
     <w:multiLevelType w:val="multilevel"/>
@@ -1373,7 +2486,6 @@
   <w:style w:type="character" w:default="1" w:styleId="DefaultParagraphFont">
     <w:name w:val="Default Paragraph Font"/>
     <w:uiPriority w:val="1"/>
-    <w:semiHidden/>
     <w:unhideWhenUsed/>
   </w:style>
   <w:style w:type="table" w:default="1" w:styleId="TableNormal">
@@ -1685,6 +2797,15 @@
       <w:color w:val="2F5496" w:themeColor="accent1" w:themeShade="BF"/>
       <w:spacing w:val="5"/>
     </w:rPr>
+  </w:style>
+  <w:style w:type="paragraph" w:styleId="NoSpacing">
+    <w:name w:val="No Spacing"/>
+    <w:uiPriority w:val="1"/>
+    <w:qFormat/>
+    <w:rsid w:val="00AD7D56"/>
+    <w:pPr>
+      <w:spacing w:after="0" w:line="240" w:lineRule="auto"/>
+    </w:pPr>
   </w:style>
 </w:styles>
 </file>

</xml_diff>

<commit_message>
Implement Blank Orb mechanics and update game design documentation
- Introduced the **Blank Orb** as the starting weapon for players, launching from the summoning circle in a random direction.
- Revised game design documents to reflect changes in gameplay mechanics, including the new orb attributes and glyph integration.
- Enhanced the ritual menu UI to facilitate orb upgrades and glyph socketing, improving player interaction.
- Updated `GAME_BRIEF.md` to clarify the gameplay loop and player strategies involving the Blank Orb and glyphs.
</commit_message>
<xml_diff>
--- a/planning/A Final Spell.docx
+++ b/planning/A Final Spell.docx
@@ -13,7 +13,7 @@
         <w:rPr>
           <w:lang w:val="en-US"/>
         </w:rPr>
-        <w:t>Tavern Roguelike</w:t>
+        <w:t>A Final Spell</w:t>
       </w:r>
     </w:p>
     <w:p>
@@ -65,7 +65,21 @@
         <w:rPr>
           <w:lang w:val="en-US"/>
         </w:rPr>
-        <w:t>r only weapon at first is a orb</w:t>
+        <w:t xml:space="preserve">r only weapon at first is </w:t>
+      </w:r>
+      <w:proofErr w:type="gramStart"/>
+      <w:r>
+        <w:rPr>
+          <w:lang w:val="en-US"/>
+        </w:rPr>
+        <w:t>a</w:t>
+      </w:r>
+      <w:proofErr w:type="gramEnd"/>
+      <w:r>
+        <w:rPr>
+          <w:lang w:val="en-US"/>
+        </w:rPr>
+        <w:t xml:space="preserve"> orb</w:t>
       </w:r>
       <w:r>
         <w:rPr>
@@ -233,7 +247,21 @@
         <w:rPr>
           <w:lang w:val="en-US"/>
         </w:rPr>
-        <w:t>You win the level when all enemies are dead. You lose if you die. You can die from enemies or getting hit by the bullet.</w:t>
+        <w:t xml:space="preserve">You win the level when all enemies are dead. You lose if you die. You can die from enemies or </w:t>
+      </w:r>
+      <w:proofErr w:type="gramStart"/>
+      <w:r>
+        <w:rPr>
+          <w:lang w:val="en-US"/>
+        </w:rPr>
+        <w:t>getting</w:t>
+      </w:r>
+      <w:proofErr w:type="gramEnd"/>
+      <w:r>
+        <w:rPr>
+          <w:lang w:val="en-US"/>
+        </w:rPr>
+        <w:t xml:space="preserve"> hit by the bullet.</w:t>
       </w:r>
       <w:r>
         <w:rPr>
@@ -296,7 +324,35 @@
         <w:rPr>
           <w:lang w:val="en-US"/>
         </w:rPr>
-        <w:t>. Doesent have to be more complicated then that. The game is more of a gameplay focused arcade game.</w:t>
+        <w:t xml:space="preserve">. Doesent </w:t>
+      </w:r>
+      <w:proofErr w:type="gramStart"/>
+      <w:r>
+        <w:rPr>
+          <w:lang w:val="en-US"/>
+        </w:rPr>
+        <w:t>have to</w:t>
+      </w:r>
+      <w:proofErr w:type="gramEnd"/>
+      <w:r>
+        <w:rPr>
+          <w:lang w:val="en-US"/>
+        </w:rPr>
+        <w:t xml:space="preserve"> be more complicated </w:t>
+      </w:r>
+      <w:proofErr w:type="gramStart"/>
+      <w:r>
+        <w:rPr>
+          <w:lang w:val="en-US"/>
+        </w:rPr>
+        <w:t>then</w:t>
+      </w:r>
+      <w:proofErr w:type="gramEnd"/>
+      <w:r>
+        <w:rPr>
+          <w:lang w:val="en-US"/>
+        </w:rPr>
+        <w:t xml:space="preserve"> that. The game is more of a gameplay focused arcade game.</w:t>
       </w:r>
       <w:r>
         <w:rPr>
@@ -389,14 +445,42 @@
         <w:rPr>
           <w:lang w:val="en-SE"/>
         </w:rPr>
-        <w:t>The orbs speed and damage increases each time you redirect it</w:t>
+        <w:t xml:space="preserve">The orbs speed and damage </w:t>
+      </w:r>
+      <w:proofErr w:type="gramStart"/>
+      <w:r>
+        <w:rPr>
+          <w:lang w:val="en-SE"/>
+        </w:rPr>
+        <w:t>increases</w:t>
+      </w:r>
+      <w:proofErr w:type="gramEnd"/>
+      <w:r>
+        <w:rPr>
+          <w:lang w:val="en-SE"/>
+        </w:rPr>
+        <w:t xml:space="preserve"> each time you redirect it</w:t>
       </w:r>
       <w:r>
         <w:rPr>
           <w:lang w:val="en-SE"/>
         </w:rPr>
         <w:br/>
-        <w:t>You start with one orb but can acquire more later on.</w:t>
+        <w:t xml:space="preserve">You start with one orb but can acquire more </w:t>
+      </w:r>
+      <w:proofErr w:type="gramStart"/>
+      <w:r>
+        <w:rPr>
+          <w:lang w:val="en-SE"/>
+        </w:rPr>
+        <w:t>later on</w:t>
+      </w:r>
+      <w:proofErr w:type="gramEnd"/>
+      <w:r>
+        <w:rPr>
+          <w:lang w:val="en-SE"/>
+        </w:rPr>
+        <w:t>.</w:t>
       </w:r>
       <w:r>
         <w:rPr>
@@ -1578,7 +1662,21 @@
         <w:rPr>
           <w:lang w:val="en-US"/>
         </w:rPr>
-        <w:t>he player can activate the summoning circle (first time free, after that price goes up by 5 mana). The next orb that enters the summoning circle opens up a menu where the player can see info about that orb, as well as an inventory at the bottom of the screen of all current orbs.</w:t>
+        <w:t xml:space="preserve">he player can activate the summoning circle (first time free, after that price goes up by 5 mana). The next orb that enters the summoning circle </w:t>
+      </w:r>
+      <w:proofErr w:type="gramStart"/>
+      <w:r>
+        <w:rPr>
+          <w:lang w:val="en-US"/>
+        </w:rPr>
+        <w:t>opens up</w:t>
+      </w:r>
+      <w:proofErr w:type="gramEnd"/>
+      <w:r>
+        <w:rPr>
+          <w:lang w:val="en-US"/>
+        </w:rPr>
+        <w:t xml:space="preserve"> a menu where the player can see info about that orb, as well as an inventory at the bottom of the screen of all current orbs.</w:t>
       </w:r>
       <w:r>
         <w:rPr>
@@ -1605,7 +1703,21 @@
           <w:lang w:val="en-US"/>
         </w:rPr>
         <w:br/>
-        <w:t>If three glyphs are added to a non-Blank Orb it can with the right combination trigger a further upgrade, called Attunement. After adding two glyphs to a orb hints of the four possible</w:t>
+        <w:t xml:space="preserve">If three glyphs are added to a non-Blank Orb it can with the right combination trigger a further upgrade, called Attunement. After adding two glyphs to </w:t>
+      </w:r>
+      <w:proofErr w:type="gramStart"/>
+      <w:r>
+        <w:rPr>
+          <w:lang w:val="en-US"/>
+        </w:rPr>
+        <w:t>a</w:t>
+      </w:r>
+      <w:proofErr w:type="gramEnd"/>
+      <w:r>
+        <w:rPr>
+          <w:lang w:val="en-US"/>
+        </w:rPr>
+        <w:t xml:space="preserve"> orb hints of the four possible</w:t>
       </w:r>
       <w:r>
         <w:rPr>
@@ -1684,7 +1796,21 @@
         <w:rPr>
           <w:lang w:val="en-US"/>
         </w:rPr>
-        <w:t xml:space="preserve">For now only </w:t>
+        <w:t xml:space="preserve">For </w:t>
+      </w:r>
+      <w:proofErr w:type="gramStart"/>
+      <w:r>
+        <w:rPr>
+          <w:lang w:val="en-US"/>
+        </w:rPr>
+        <w:t>now</w:t>
+      </w:r>
+      <w:proofErr w:type="gramEnd"/>
+      <w:r>
+        <w:rPr>
+          <w:lang w:val="en-US"/>
+        </w:rPr>
+        <w:t xml:space="preserve"> only </w:t>
       </w:r>
       <w:r>
         <w:rPr>
@@ -1696,7 +1822,35 @@
         <w:rPr>
           <w:lang w:val="en-US"/>
         </w:rPr>
-        <w:t xml:space="preserve">basic enemy that chases the player and </w:t>
+        <w:t xml:space="preserve">basic </w:t>
+      </w:r>
+      <w:proofErr w:type="gramStart"/>
+      <w:r>
+        <w:rPr>
+          <w:lang w:val="en-US"/>
+        </w:rPr>
+        <w:t>enemy</w:t>
+      </w:r>
+      <w:proofErr w:type="gramEnd"/>
+      <w:r>
+        <w:rPr>
+          <w:lang w:val="en-US"/>
+        </w:rPr>
+        <w:t xml:space="preserve"> that </w:t>
+      </w:r>
+      <w:proofErr w:type="gramStart"/>
+      <w:r>
+        <w:rPr>
+          <w:lang w:val="en-US"/>
+        </w:rPr>
+        <w:t>chases</w:t>
+      </w:r>
+      <w:proofErr w:type="gramEnd"/>
+      <w:r>
+        <w:rPr>
+          <w:lang w:val="en-US"/>
+        </w:rPr>
+        <w:t xml:space="preserve"> the player and </w:t>
       </w:r>
       <w:r>
         <w:rPr>
@@ -2486,6 +2640,7 @@
   <w:style w:type="character" w:default="1" w:styleId="DefaultParagraphFont">
     <w:name w:val="Default Paragraph Font"/>
     <w:uiPriority w:val="1"/>
+    <w:semiHidden/>
     <w:unhideWhenUsed/>
   </w:style>
   <w:style w:type="table" w:default="1" w:styleId="TableNormal">

</xml_diff>